<commit_message>
Clarify primary care Lyme services and questions for health centers
</commit_message>
<xml_diff>
--- a/submission/PathwayAI_Final_Script_and_20_Minute_QA.docx
+++ b/submission/PathwayAI_Final_Script_and_20_Minute_QA.docx
@@ -33,7 +33,7 @@
     </w:p>
     <w:p>
       <w:r>
-        <w:t>708 spoken words. Target: under five minutes. Actual generated audio has not been timed. Bracketed cues are delivery directions; ElevenLabs support varies by model. For the live demo, explicitly say whether external AI is on or off, and label saved examples as previously generated.</w:t>
+        <w:t>727 spoken words. Target: under five minutes. Actual generated audio has not been timed. Bracketed cues are delivery directions; ElevenLabs support varies by model. For the live demo, explicitly say whether external AI is on or off, and label saved examples as previously generated.</w:t>
       </w:r>
     </w:p>
     <w:p>
@@ -83,7 +83,7 @@
     </w:p>
     <w:p>
       <w:r>
-        <w:t>In Care and Support, people without insurance can find community health centers and questions about income-based fees and hospital financial assistance. Care is not automatically free, but they have somewhere to start.</w:t>
+        <w:t>In Care and Support, people without insurance can find community health centers. Early Lyme disease can often be managed in primary care. The app helps people ask whether a center offers evaluation, treatment, or referral—and about income-based fees and interpreter services. Care is not automatically free, and services vary by location.</w:t>
       </w:r>
     </w:p>
     <w:p>
@@ -291,7 +291,7 @@
     </w:p>
     <w:p>
       <w:r>
-        <w:t>A patient can prepare a clearer account of exposure, symptoms, test results, and care, then review and download it. They can find questions about uninsured care and financial assistance and keep expenses, missed work, and unpaid help together. We have not established that these tools shorten diagnosis or improve treatment outcomes. The first evaluation should test accuracy, ease of use, and usefulness in support conversations.</w:t>
+        <w:t>A patient can prepare a clearer account of exposure, symptoms, test results, and care, then review and download it. Early Lyme disease can often be managed in primary care, but each center must confirm evaluation, treatment or referral, appointment timing, interpreter access, and fees. They can find questions about uninsured care and financial assistance and keep expenses, missed work, and unpaid help together. We have not established that these tools shorten diagnosis or improve treatment outcomes. The first evaluation should test accuracy, ease of use, and usefulness in support conversations.</w:t>
       </w:r>
     </w:p>
     <w:p>

</xml_diff>

<commit_message>
Strengthen benefit-led narration and check supplied HHS Phase 2 requirements
</commit_message>
<xml_diff>
--- a/submission/PathwayAI_Final_Script_and_20_Minute_QA.docx
+++ b/submission/PathwayAI_Final_Script_and_20_Minute_QA.docx
@@ -33,7 +33,7 @@
     </w:p>
     <w:p>
       <w:r>
-        <w:t>727 spoken words. Target: under five minutes. Actual generated audio has not been timed. Bracketed cues are delivery directions; ElevenLabs support varies by model. For the live demo, explicitly say whether external AI is on or off, and label saved examples as previously generated.</w:t>
+        <w:t>753 spoken words. Rehearse the actual audio to stay under five minutes. Bracketed delivery cues depend on the ElevenLabs model. For the demonstration, explicitly say whether external AI is on or off; label saved outputs as previously generated.</w:t>
       </w:r>
     </w:p>
     <w:p>
@@ -53,12 +53,12 @@
     </w:p>
     <w:p>
       <w:r>
-        <w:t>That experience taught me how difficult it can be to navigate care while worrying about costs—and how language can make those conversations harder.</w:t>
+        <w:t>That experience taught me how difficult it can be to find care while worrying about costs—and how language can make those conversations harder.</w:t>
       </w:r>
     </w:p>
     <w:p>
       <w:r>
-        <w:t>I kept thinking: how could we help other families feel better prepared?</w:t>
+        <w:t>I kept thinking: how could we help another family feel better prepared?</w:t>
       </w:r>
     </w:p>
     <w:p>
@@ -68,57 +68,57 @@
     </w:p>
     <w:p>
       <w:r>
-        <w:t>A medical bill shows only part of what illness costs. It misses time spent finding care, work missed, and unpaid help from family.</w:t>
+        <w:t>A medical bill shows only part of what illness costs. What about the work you miss? The travel? The family member who gives up their time to help?</w:t>
       </w:r>
     </w:p>
     <w:p>
       <w:r>
-        <w:t>PathwayAI makes several parts of that burden visible and connects practical patient support with public evidence for community planning. [pause]</w:t>
+        <w:t>PathwayAI helps patients put those experiences into a useful record—and helps communities ask where support is needed. [pause]</w:t>
       </w:r>
     </w:p>
     <w:p>
       <w:r>
-        <w:t>[warm] First, what does a patient gain?</w:t>
+        <w:t>[warm] Let’s start with a person who needs care.</w:t>
       </w:r>
     </w:p>
     <w:p>
       <w:r>
-        <w:t>In Care and Support, people without insurance can find community health centers. Early Lyme disease can often be managed in primary care. The app helps people ask whether a center offers evaluation, treatment, or referral—and about income-based fees and interpreter services. Care is not automatically free, and services vary by location.</w:t>
+        <w:t>In Care and Support, someone without insurance can find community health centers and questions about affordable care. Early Lyme disease can often be managed in primary care. We help people ask about evaluation, treatment, referrals, fees, and interpreters. Services vary; care is not automatically free.</w:t>
       </w:r>
     </w:p>
     <w:p>
       <w:r>
-        <w:t>In Learn and Prevent, they can download an outdoor preparation plan. Tick Bite: What Next explains removal, what to record, and when to contact a clinician. Early, appropriate treatment can help prevent more severe Lyme disease. [short pause]</w:t>
+        <w:t>We also help people prepare before illness. Learn and Prevent offers a downloadable outdoor plan. Tick Bite: What Next explains removal, what to record, and when to contact a clinician. Early, appropriate treatment can help prevent more severe Lyme disease. [short pause]</w:t>
       </w:r>
     </w:p>
     <w:p>
       <w:r>
-        <w:t>Now let’s follow a fictional patient preparing for a visit.</w:t>
+        <w:t>Now imagine preparing for an appointment. All patient details in this demonstration are fictional.</w:t>
       </w:r>
     </w:p>
     <w:p>
       <w:r>
-        <w:t>They record exposure, symptoms, tests, and care, then review and correct a timeline. Symptom onset and diagnosis delay stay separate. They can download the summary and bring their original test report. [short pause]</w:t>
+        <w:t>Enter what happened. Review the timeline. Correct anything missing. Download a visit summary and bring the original test report.</w:t>
       </w:r>
     </w:p>
     <w:p>
       <w:r>
-        <w:t>People can write in their preferred language or mix languages. With permission, optional external AI helps organize an English summary alongside the original for review.</w:t>
+        <w:t>The benefit is having important details together when it is time to explain them. [short pause]</w:t>
       </w:r>
     </w:p>
     <w:p>
       <w:r>
-        <w:t>The purpose is to help someone explain symptoms and ask questions with more confidence. It does not diagnose illness or replace a qualified interpreter.</w:t>
+        <w:t>For someone uncomfortable speaking English, that conversation can feel overwhelming. People can write in their preferred language or mix languages.</w:t>
       </w:r>
     </w:p>
     <w:p>
       <w:r>
-        <w:t>We have invited Mandarin-, Spanish-, and English-speaking reviewers to test clarity and whether summaries preserve their meaning. That work is ongoing. The English organizer also works without external AI. [pause]</w:t>
+        <w:t>With permission, optional external AI helps organize an English summary alongside the original for review. It does not diagnose illness or replace a qualified interpreter. The English organizer also works without external AI. [pause]</w:t>
       </w:r>
     </w:p>
     <w:p>
       <w:r>
-        <w:t>[serious] What about the burden itself?</w:t>
+        <w:t>[serious] Now look at what the bill misses.</w:t>
       </w:r>
     </w:p>
     <w:p>
@@ -128,77 +128,87 @@
     </w:p>
     <w:p>
       <w:r>
-        <w:t>The record shows 225 dollars paid, three workdays, and eight caregiving hours. We keep those units separate rather than invent a single total.</w:t>
+        <w:t>The record shows 225 dollars paid. Workdays and caregiving hours stay separate.</w:t>
       </w:r>
     </w:p>
     <w:p>
       <w:r>
-        <w:t>Select Download appointment and cost summary to save the record. The care-access checklist provides questions for a clinic or billing office.</w:t>
+        <w:t>Download the appointment and cost summary. Use the care-access checklist for questions to a clinic or billing office.</w:t>
       </w:r>
     </w:p>
     <w:p>
       <w:r>
-        <w:t>Adding numbers alone will not pay a bill. But a clearer record can help someone explain what support they need. [pause]</w:t>
+        <w:t>A total alone will not pay a bill. A clear record can help someone explain what support they need. [pause]</w:t>
       </w:r>
     </w:p>
     <w:p>
       <w:r>
-        <w:t>[curious] Second, what does a community gain?</w:t>
+        <w:t>[curious] What does this mean for a community?</w:t>
       </w:r>
     </w:p>
     <w:p>
       <w:r>
-        <w:t>In Community Burden and Action, we compare Dutchess and Orange counties using public evidence.</w:t>
+        <w:t>Our intended organizational users are county health departments and community partners. They need to decide where to focus limited resources.</w:t>
       </w:r>
     </w:p>
     <w:p>
       <w:r>
-        <w:t>New York surveillance provides reported Lyme cases and rates. Census data adds population and language context. HRSA describes healthcare resources. CDC tick surveillance informs exposure context, and CDC PLACES adds broader community-health estimates. CMS provides separate Original Medicare spending context—not Lyme-specific costs.</w:t>
+        <w:t>Community Burden and Action brings together New York Lyme surveillance, Census population and language data, HRSA healthcare resources, CDC tick surveillance, and CDC PLACES community-health estimates. CMS adds separate Original Medicare payment context—not Lyme-specific spending.</w:t>
       </w:r>
     </w:p>
     <w:p>
       <w:r>
-        <w:t>Here is one transparent calculation. Dutchess reported 1,060 cases in 2024. Multiplying that by Hook’s published average societal cost of 2,032 dollars gives an illustration of about 2.15 million dollars, expressed in 2016 dollars.</w:t>
+        <w:t>Here is the calculation: 1,060 Dutchess cases reported in 2024, multiplied by Hook’s societal-cost benchmark of 2,032 dollars, gives about 2.15 million dollars in 2016 dollars.</w:t>
       </w:r>
     </w:p>
     <w:p>
       <w:r>
-        <w:t>The source and formula stay visible. This is not measured county spending or demonstrated savings. [pause]</w:t>
+        <w:t>We show the source and formula. It is an illustration—not measured county spending or proven savings. [pause]</w:t>
       </w:r>
     </w:p>
     <w:p>
       <w:r>
-        <w:t>[explaining] What can a community do next?</w:t>
+        <w:t>[explaining] Then we move from information to a possible action.</w:t>
       </w:r>
     </w:p>
     <w:p>
       <w:r>
-        <w:t>The planning brief connects a need with possible actions, partners, and measures. A care-navigation pilot could help uninsured residents connect with existing services and prepare for language-support and billing conversations.</w:t>
+        <w:t>Health departments already share prevention information at local events. A partnership could help residents leave with an outdoor plan, a visit note, or questions about affordable care.</w:t>
       </w:r>
     </w:p>
     <w:p>
       <w:r>
-        <w:t>Partners would confirm capacity and resources, then track completed referrals, appointments reached, assistance received, and unresolved needs.</w:t>
+        <w:t>A future secure pilot, with explicit consent, could document unmet needs. Resource information would remain available without contributing personal information.</w:t>
       </w:r>
     </w:p>
     <w:p>
       <w:r>
-        <w:t>Patient experiences can reveal barriers that county averages miss. Public data helps put those questions in context. Personal notes are not automatically sent to counties; secure, consent-based reporting is a future goal. [pause]</w:t>
+        <w:t>Partners could consider those findings alongside public data, confirm available resources, and track referrals completed, appointments reached, and needs still unmet. Personal notes are not automatically sent to counties. [pause]</w:t>
       </w:r>
     </w:p>
     <w:p>
       <w:r>
-        <w:t>[hopeful] People living with Lyme disease and a county health commissioner reviewed the working app. Their feedback helped us simplify choices and clarify next steps.</w:t>
+        <w:t>[hopeful] People living with Lyme disease and a county health commissioner reviewed the working app. Their feedback helped us simplify instructions and make support resources available without entering a story.</w:t>
       </w:r>
     </w:p>
     <w:p>
       <w:r>
-        <w:t>We welcome patient groups, health centers, and community partners for a small pilot. We will evaluate usefulness before claiming better outcomes or savings. Our proposed model keeps patient access free through grants and partnerships. [short pause]</w:t>
+        <w:t>We have invited Mandarin-, Spanish-, and English-speaking reviewers to test clarity and meaning. That work is ongoing.</w:t>
       </w:r>
     </w:p>
     <w:p>
       <w:r>
-        <w:t>AI can help organize words. Data can reveal patterns. Patients remain at the center. [pause]</w:t>
+        <w:t>The pilot app is publicly accessible. We plan to reach users through patient groups, health centers, and local public-health partners. Our proposed model keeps patient access free through grants and partnerships.</w:t>
+      </w:r>
+    </w:p>
+    <w:p>
+      <w:r>
+        <w:t>Next, we want a small partner pilot to test usefulness and support connections before claiming better outcomes or savings. The same record structure could be adapted to other illnesses, with condition-specific review. Scan the code to try the app or discuss a pilot. [pause]</w:t>
+      </w:r>
+    </w:p>
+    <w:p>
+      <w:r>
+        <w:t>AI can help organize words. Data can reveal patterns. Patients remain at the center.</w:t>
       </w:r>
     </w:p>
     <w:p>
@@ -647,6 +657,249 @@
         <w:t>CMS Medicare Geographic Variation: https://data.cms.gov/summary-statistics-on-use-and-payments/medicare-geographic-comparisons/medicare-geographic-variation-by-national-state-county</w:t>
       </w:r>
     </w:p>
+    <w:p>
+      <w:r>
+        <w:br w:type="page"/>
+      </w:r>
+    </w:p>
+    <w:p>
+      <w:pPr>
+        <w:pStyle w:val="Heading1"/>
+      </w:pPr>
+      <w:r>
+        <w:t>Organizer-template coverage</w:t>
+      </w:r>
+    </w:p>
+    <w:p>
+      <w:r>
+        <w:t>Rechecked October 21, 2026 against the uploaded MVP Demo Milestone.pptx. This checklist is for preparation, not narration. Requests to HHS and Challenge.gov were blocked with HTTP 403; current website requirements were not independently verified.</w:t>
+      </w:r>
+    </w:p>
+    <w:tbl>
+      <w:tblPr>
+        <w:tblStyle w:val="LightShading-Accent1"/>
+        <w:tblW w:type="auto" w:w="0"/>
+        <w:tblLook w:firstColumn="1" w:firstRow="1" w:lastColumn="0" w:lastRow="0" w:noHBand="0" w:noVBand="1" w:val="04A0"/>
+      </w:tblPr>
+      <w:tblGrid>
+        <w:gridCol w:w="4320"/>
+        <w:gridCol w:w="4320"/>
+      </w:tblGrid>
+      <w:tr>
+        <w:tc>
+          <w:tcPr>
+            <w:tcW w:type="dxa" w:w="4320"/>
+          </w:tcPr>
+          <w:p>
+            <w:r>
+              <w:t>Template requirement</w:t>
+            </w:r>
+          </w:p>
+        </w:tc>
+        <w:tc>
+          <w:tcPr>
+            <w:tcW w:type="dxa" w:w="4320"/>
+          </w:tcPr>
+          <w:p>
+            <w:r>
+              <w:t>Script / on-screen evidence</w:t>
+            </w:r>
+          </w:p>
+        </w:tc>
+      </w:tr>
+      <w:tr>
+        <w:tc>
+          <w:tcPr>
+            <w:tcW w:type="dxa" w:w="4320"/>
+          </w:tcPr>
+          <w:p>
+            <w:r>
+              <w:t>Submission and presenter</w:t>
+            </w:r>
+          </w:p>
+        </w:tc>
+        <w:tc>
+          <w:tcPr>
+            <w:tcW w:type="dxa" w:w="4320"/>
+          </w:tcPr>
+          <w:p>
+            <w:r>
+              <w:t>PathwayAI; Yuwei Zhang. Keep the official submitted title on the cover.</w:t>
+            </w:r>
+          </w:p>
+        </w:tc>
+      </w:tr>
+      <w:tr>
+        <w:tc>
+          <w:tcPr>
+            <w:tcW w:type="dxa" w:w="4320"/>
+          </w:tcPr>
+          <w:p>
+            <w:r>
+              <w:t>Complete journey and core features</w:t>
+            </w:r>
+          </w:p>
+        </w:tc>
+        <w:tc>
+          <w:tcPr>
+            <w:tcW w:type="dxa" w:w="4320"/>
+          </w:tcPr>
+          <w:p>
+            <w:r>
+              <w:t>Prevention, tick-bite guidance, visit preparation, language/AI, personal burden record and community planning. Demonstrate outputs; narration alone is not evidence.</w:t>
+            </w:r>
+          </w:p>
+        </w:tc>
+      </w:tr>
+      <w:tr>
+        <w:tc>
+          <w:tcPr>
+            <w:tcW w:type="dxa" w:w="4320"/>
+          </w:tcPr>
+          <w:p>
+            <w:r>
+              <w:t>End users and advocates</w:t>
+            </w:r>
+          </w:p>
+        </w:tc>
+        <w:tc>
+          <w:tcPr>
+            <w:tcW w:type="dxa" w:w="4320"/>
+          </w:tcPr>
+          <w:p>
+            <w:r>
+              <w:t>Patients and caregivers; intended county/community users; formative patient and county-commissioner feedback.</w:t>
+            </w:r>
+          </w:p>
+        </w:tc>
+      </w:tr>
+      <w:tr>
+        <w:tc>
+          <w:tcPr>
+            <w:tcW w:type="dxa" w:w="4320"/>
+          </w:tcPr>
+          <w:p>
+            <w:r>
+              <w:t>Federal open data</w:t>
+            </w:r>
+          </w:p>
+        </w:tc>
+        <w:tc>
+          <w:tcPr>
+            <w:tcW w:type="dxa" w:w="4320"/>
+          </w:tcPr>
+          <w:p>
+            <w:r>
+              <w:t>Census, HRSA, CDC tick surveillance, CDC PLACES and CMS. NYSDOH and published research are separate sources.</w:t>
+            </w:r>
+          </w:p>
+        </w:tc>
+      </w:tr>
+      <w:tr>
+        <w:tc>
+          <w:tcPr>
+            <w:tcW w:type="dxa" w:w="4320"/>
+          </w:tcPr>
+          <w:p>
+            <w:r>
+              <w:t>Testing evidence and lessons</w:t>
+            </w:r>
+          </w:p>
+        </w:tc>
+        <w:tc>
+          <w:tcPr>
+            <w:tcW w:type="dxa" w:w="4320"/>
+          </w:tcPr>
+          <w:p>
+            <w:r>
+              <w:t>Simpler instructions and resources without story entry. Language testing remains ongoing. No unmeasured outcomes are claimed.</w:t>
+            </w:r>
+          </w:p>
+        </w:tc>
+      </w:tr>
+      <w:tr>
+        <w:tc>
+          <w:tcPr>
+            <w:tcW w:type="dxa" w:w="4320"/>
+          </w:tcPr>
+          <w:p>
+            <w:r>
+              <w:t>Deployment and launch</w:t>
+            </w:r>
+          </w:p>
+        </w:tc>
+        <w:tc>
+          <w:tcPr>
+            <w:tcW w:type="dxa" w:w="4320"/>
+          </w:tcPr>
+          <w:p>
+            <w:r>
+              <w:t>Publicly accessible pilot; intended outreach through patient groups, health centers and public-health partners.</w:t>
+            </w:r>
+          </w:p>
+        </w:tc>
+      </w:tr>
+      <w:tr>
+        <w:tc>
+          <w:tcPr>
+            <w:tcW w:type="dxa" w:w="4320"/>
+          </w:tcPr>
+          <w:p>
+            <w:r>
+              <w:t>Sustainability, roadmap and involvement</w:t>
+            </w:r>
+          </w:p>
+        </w:tc>
+        <w:tc>
+          <w:tcPr>
+            <w:tcW w:type="dxa" w:w="4320"/>
+          </w:tcPr>
+          <w:p>
+            <w:r>
+              <w:t>Proposed grant/partnership model; small pilot; secure reporting remains future work; app QR code and partner invitation.</w:t>
+            </w:r>
+          </w:p>
+        </w:tc>
+      </w:tr>
+    </w:tbl>
+    <w:p>
+      <w:pPr>
+        <w:pStyle w:val="Heading1"/>
+      </w:pPr>
+      <w:r>
+        <w:t>Additional check against supplied HHS announcement</w:t>
+      </w:r>
+    </w:p>
+    <w:p>
+      <w:r>
+        <w:t>Reviewed the user-supplied announcement text, marked last reviewed October 1, 2026. This is a review of supplied text, not independent verification of a live HHS page. The pasted Phase 2 rubric names four criteria and emphasizes demonstrated performance, execution and real-world applicability. No equal weighting is assumed.</w:t>
+      </w:r>
+    </w:p>
+    <w:p>
+      <w:r>
+        <w:t>Results for the American People: show a real workflow and reviewed output; do not claim reduced delays or savings without evidence.</w:t>
+      </w:r>
+    </w:p>
+    <w:p>
+      <w:r>
+        <w:t>Data, Tech &amp; Evidence-Driven Innovation: show source roles, one reproducible calculation and the actual optional AI task.</w:t>
+      </w:r>
+    </w:p>
+    <w:p>
+      <w:r>
+        <w:t>Execution, Efficiency &amp; Delivery: demonstrate a working journey and download, describe deployment, and report documented usability observations.</w:t>
+      </w:r>
+    </w:p>
+    <w:p>
+      <w:r>
+        <w:t>Scalability, Reuse &amp; Societal Impact: the structure could be reused after condition-specific review; no current FHIR, TEFCA or Blue Button integration is claimed.</w:t>
+      </w:r>
+    </w:p>
+    <w:p>
+      <w:r>
+        <w:t>Separate Phase 2 submission fields in the supplied announcement: Results (250 words maximum), Data/Tech/Evidence (300), Execution/Efficiency/Delivery (250), Scalability/Reuse/Impact (250), plus the MVP demonstration. A five-minute video does not automatically complete these written fields.</w:t>
+      </w:r>
+    </w:p>
     <w:sectPr>
       <w:footerReference w:type="default" r:id="rId9"/>
       <w:pgSz w:w="12240" w:h="15840"/>
@@ -1034,9 +1287,6 @@
     <w:name w:val="Normal"/>
     <w:qFormat/>
     <w:rsid w:val="00FC693F"/>
-    <w:pPr>
-      <w:spacing w:after="160"/>
-    </w:pPr>
     <w:rPr>
       <w:rFonts w:ascii="Calibri" w:hAnsi="Calibri"/>
       <w:sz w:val="24"/>
@@ -1104,7 +1354,7 @@
       <w:rFonts w:asciiTheme="majorHAnsi" w:eastAsiaTheme="majorEastAsia" w:hAnsiTheme="majorHAnsi" w:cstheme="majorBidi"/>
       <w:b/>
       <w:bCs/>
-      <w:color w:val="142B49"/>
+      <w:color w:val="365F91" w:themeColor="accent1" w:themeShade="BF"/>
       <w:sz w:val="28"/>
       <w:szCs w:val="28"/>
     </w:rPr>
@@ -1128,7 +1378,7 @@
       <w:rFonts w:asciiTheme="majorHAnsi" w:eastAsiaTheme="majorEastAsia" w:hAnsiTheme="majorHAnsi" w:cstheme="majorBidi"/>
       <w:b/>
       <w:bCs/>
-      <w:color w:val="142B49"/>
+      <w:color w:val="4F81BD" w:themeColor="accent1"/>
       <w:sz w:val="26"/>
       <w:szCs w:val="26"/>
     </w:rPr>
@@ -1391,7 +1641,7 @@
     </w:pPr>
     <w:rPr>
       <w:rFonts w:asciiTheme="majorHAnsi" w:eastAsiaTheme="majorEastAsia" w:hAnsiTheme="majorHAnsi" w:cstheme="majorBidi"/>
-      <w:color w:val="142B49"/>
+      <w:color w:val="17365D" w:themeColor="text2" w:themeShade="BF"/>
       <w:spacing w:val="5"/>
       <w:kern w:val="28"/>
       <w:sz w:val="52"/>

</xml_diff>

<commit_message>
Connect demo care-navigation proposal to checked Dutchess access evidence
</commit_message>
<xml_diff>
--- a/submission/PathwayAI_Final_Script_and_20_Minute_QA.docx
+++ b/submission/PathwayAI_Final_Script_and_20_Minute_QA.docx
@@ -20,7 +20,7 @@
     </w:p>
     <w:p>
       <w:r>
-        <w:t>Yuwei Zhang | HHS TOPx Cost of Illness</w:t>
+        <w:t>HHS TOPx Cost of Illness | Updated October 21, 2026</w:t>
       </w:r>
     </w:p>
     <w:p>
@@ -33,7 +33,7 @@
     </w:p>
     <w:p>
       <w:r>
-        <w:t>753 spoken words. Rehearse the actual audio to stay under five minutes. Bracketed delivery cues depend on the ElevenLabs model. For the demonstration, explicitly say whether external AI is on or off; label saved outputs as previously generated.</w:t>
+        <w:t>757 spoken words. Check actual audio against the five-minute limit. Bracketed delivery cues depend on the selected ElevenLabs model. State whether external AI is on or off during the demonstration; identify saved examples as previously generated.</w:t>
       </w:r>
     </w:p>
     <w:p>
@@ -63,57 +63,57 @@
     </w:p>
     <w:p>
       <w:r>
-        <w:t>I’m Yuwei Zhang. Those lessons led me to build PathwayAI. [pause]</w:t>
+        <w:t>Those lessons led me to build PathwayAI. [pause]</w:t>
       </w:r>
     </w:p>
     <w:p>
       <w:r>
-        <w:t>A medical bill shows only part of what illness costs. What about the work you miss? The travel? The family member who gives up their time to help?</w:t>
+        <w:t>A medical bill shows only part of what illness costs. What about missed work, travel, and unpaid help from family?</w:t>
       </w:r>
     </w:p>
     <w:p>
       <w:r>
-        <w:t>PathwayAI helps patients put those experiences into a useful record—and helps communities ask where support is needed. [pause]</w:t>
+        <w:t>PathwayAI helps people make that burden visible—and connects practical support with evidence for community planning. [pause]</w:t>
       </w:r>
     </w:p>
     <w:p>
       <w:r>
-        <w:t>[warm] Let’s start with a person who needs care.</w:t>
+        <w:t>[warm] Let me show you.</w:t>
       </w:r>
     </w:p>
     <w:p>
       <w:r>
-        <w:t>In Care and Support, someone without insurance can find community health centers and questions about affordable care. Early Lyme disease can often be managed in primary care. We help people ask about evaluation, treatment, referrals, fees, and interpreters. Services vary; care is not automatically free.</w:t>
+        <w:t>Choose what would help today: outdoor preparation, help after a tick bite, preparing for care, or community planning. Quick and easy gives shorter explanations.</w:t>
       </w:r>
     </w:p>
     <w:p>
       <w:r>
-        <w:t>We also help people prepare before illness. Learn and Prevent offers a downloadable outdoor plan. Tick Bite: What Next explains removal, what to record, and when to contact a clinician. Early, appropriate treatment can help prevent more severe Lyme disease. [short pause]</w:t>
+        <w:t>Learn and Prevent offers a downloadable outdoor plan. Tick Bite: What Next explains removal, what to record, and when to contact a clinician. Early, appropriate treatment can help prevent more severe Lyme disease.</w:t>
       </w:r>
     </w:p>
     <w:p>
       <w:r>
-        <w:t>Now imagine preparing for an appointment. All patient details in this demonstration are fictional.</w:t>
+        <w:t>In Care and Support, people without insurance can find community health centers and questions about affordable care. Early Lyme disease can often be managed in primary care. Ask the center about evaluation, treatment, referrals, fees, and interpreters. Services vary; care is not automatically free. [pause]</w:t>
       </w:r>
     </w:p>
     <w:p>
       <w:r>
-        <w:t>Enter what happened. Review the timeline. Correct anything missing. Download a visit summary and bring the original test report.</w:t>
+        <w:t>Now imagine preparing for an appointment. Every patient detail in this demonstration is fictional.</w:t>
       </w:r>
     </w:p>
     <w:p>
       <w:r>
-        <w:t>The benefit is having important details together when it is time to explain them. [short pause]</w:t>
+        <w:t>Enter what happened. Review and correct the timeline. Download the visit summary and bring the original test report.</w:t>
       </w:r>
     </w:p>
     <w:p>
       <w:r>
-        <w:t>For someone uncomfortable speaking English, that conversation can feel overwhelming. People can write in their preferred language or mix languages.</w:t>
+        <w:t>For someone uncomfortable speaking English, explaining symptoms can feel overwhelming. People can write in their preferred language or mix languages.</w:t>
       </w:r>
     </w:p>
     <w:p>
       <w:r>
-        <w:t>With permission, optional external AI helps organize an English summary alongside the original for review. It does not diagnose illness or replace a qualified interpreter. The English organizer also works without external AI. [pause]</w:t>
+        <w:t>With permission, optional external AI helps prepare an English summary alongside the original for review. It supports preparation, not diagnosis or qualified medical interpretation. The English organizer also works without external AI. [pause]</w:t>
       </w:r>
     </w:p>
     <w:p>
@@ -128,87 +128,97 @@
     </w:p>
     <w:p>
       <w:r>
-        <w:t>The record shows 225 dollars paid. Workdays and caregiving hours stay separate.</w:t>
+        <w:t>That is 225 dollars paid. Workdays and caregiving hours stay separate.</w:t>
       </w:r>
     </w:p>
     <w:p>
       <w:r>
-        <w:t>Download the appointment and cost summary. Use the care-access checklist for questions to a clinic or billing office.</w:t>
+        <w:t>Download the appointment and cost summary. Use the care-access checklist when calling a clinic or billing office.</w:t>
       </w:r>
     </w:p>
     <w:p>
       <w:r>
-        <w:t>A total alone will not pay a bill. A clear record can help someone explain what support they need. [pause]</w:t>
+        <w:t>A total alone will not pay a bill. A clearer record can help someone explain what support they need. [pause]</w:t>
       </w:r>
     </w:p>
     <w:p>
       <w:r>
-        <w:t>[curious] What does this mean for a community?</w:t>
+        <w:t>[curious] What can a community do?</w:t>
       </w:r>
     </w:p>
     <w:p>
       <w:r>
-        <w:t>Our intended organizational users are county health departments and community partners. They need to decide where to focus limited resources.</w:t>
+        <w:t>County health departments and community partners are our intended organizational users. Public data helps them frame decisions about limited resources.</w:t>
       </w:r>
     </w:p>
     <w:p>
       <w:r>
-        <w:t>Community Burden and Action brings together New York Lyme surveillance, Census population and language data, HRSA healthcare resources, CDC tick surveillance, and CDC PLACES community-health estimates. CMS adds separate Original Medicare payment context—not Lyme-specific spending.</w:t>
+        <w:t>For example, CDC PLACES estimates that 6.5 percent of Dutchess adults aged 18 to 64 lacked health insurance in 2023. The county health plan also identifies access and coverage concerns. These are community findings, not Lyme-specific estimates.</w:t>
       </w:r>
     </w:p>
     <w:p>
       <w:r>
-        <w:t>Here is the calculation: 1,060 Dutchess cases reported in 2024, multiplied by Hook’s societal-cost benchmark of 2,032 dollars, gives about 2.15 million dollars in 2016 dollars.</w:t>
+        <w:t>They give us a reason to explore care navigation—and a question to test. [short pause]</w:t>
       </w:r>
     </w:p>
     <w:p>
       <w:r>
-        <w:t>We show the source and formula. It is an illustration—not measured county spending or proven savings. [pause]</w:t>
+        <w:t>PathwayAI combines New York Lyme surveillance with Census population and language context, HRSA healthcare resources, CDC tick surveillance, and CDC PLACES estimates. CMS adds separate Original Medicare payment context—not Lyme-specific spending.</w:t>
       </w:r>
     </w:p>
     <w:p>
       <w:r>
-        <w:t>[explaining] Then we move from information to a possible action.</w:t>
+        <w:t>One calculation is fully visible: 1,060 Dutchess cases reported in 2024, multiplied by Hook’s societal-cost benchmark of 2,032 dollars, gives about 2.15 million dollars, expressed in 2016 dollars.</w:t>
       </w:r>
     </w:p>
     <w:p>
       <w:r>
-        <w:t>Health departments already share prevention information at local events. A partnership could help residents leave with an outdoor plan, a visit note, or questions about affordable care.</w:t>
+        <w:t>That is a study-based illustration, not measured county spending. Our survey highlights experiences to investigate. Horn’s research supports attention to follow-up needs. Neither is added to that dollar total. [pause]</w:t>
       </w:r>
     </w:p>
     <w:p>
       <w:r>
-        <w:t>A future secure pilot, with explicit consent, could document unmet needs. Resource information would remain available without contributing personal information.</w:t>
+        <w:t>[explaining] Then we connect evidence with a possible action.</w:t>
       </w:r>
     </w:p>
     <w:p>
       <w:r>
-        <w:t>Partners could consider those findings alongside public data, confirm available resources, and track referrals completed, appointments reached, and needs still unmet. Personal notes are not automatically sent to counties. [pause]</w:t>
+        <w:t>At local events, partners could introduce prevention information and preparation tools. Residents could leave with a plan, a visit note, or questions about affordable care.</w:t>
       </w:r>
     </w:p>
     <w:p>
       <w:r>
-        <w:t>[hopeful] People living with Lyme disease and a county health commissioner reviewed the working app. Their feedback helped us simplify instructions and make support resources available without entering a story.</w:t>
+        <w:t>A future secure pilot, with explicit consent, could document unmet needs. Resources would remain available without contributing personal information. Personal notes are not automatically sent to counties.</w:t>
       </w:r>
     </w:p>
     <w:p>
       <w:r>
-        <w:t>We have invited Mandarin-, Spanish-, and English-speaking reviewers to test clarity and meaning. That work is ongoing.</w:t>
+        <w:t>Partners would confirm service capacity and resources, then track referrals completed, appointments reached, and needs still unmet. [pause]</w:t>
       </w:r>
     </w:p>
     <w:p>
       <w:r>
-        <w:t>The pilot app is publicly accessible. We plan to reach users through patient groups, health centers, and local public-health partners. Our proposed model keeps patient access free through grants and partnerships.</w:t>
+        <w:t>[hopeful] People living with Lyme disease and a county health commissioner reviewed the working app. Their feedback helped us simplify instructions and make resources available without entering a story.</w:t>
       </w:r>
     </w:p>
     <w:p>
       <w:r>
-        <w:t>Next, we want a small partner pilot to test usefulness and support connections before claiming better outcomes or savings. The same record structure could be adapted to other illnesses, with condition-specific review. Scan the code to try the app or discuss a pilot. [pause]</w:t>
+        <w:t>Mandarin-, Spanish-, and English-speaking reviewers have also been invited. That testing is ongoing.</w:t>
       </w:r>
     </w:p>
     <w:p>
       <w:r>
-        <w:t>AI can help organize words. Data can reveal patterns. Patients remain at the center.</w:t>
+        <w:t>The app is publicly accessible. We welcome patient groups, health centers, and community partners for a small pilot. We will test usefulness before claiming better outcomes or savings.</w:t>
+      </w:r>
+    </w:p>
+    <w:p>
+      <w:r>
+        <w:t>Grants and partnerships are our proposed model for keeping patient access free. The structure could be adapted to other illnesses after condition-specific review. [short pause]</w:t>
+      </w:r>
+    </w:p>
+    <w:p>
+      <w:r>
+        <w:t>AI can help organize words. Data can reveal patterns. Patients remain at the center. [pause]</w:t>
       </w:r>
     </w:p>
     <w:p>
@@ -900,6 +910,34 @@
         <w:t>Separate Phase 2 submission fields in the supplied announcement: Results (250 words maximum), Data/Tech/Evidence (300), Execution/Efficiency/Delivery (250), Scalability/Reuse/Impact (250), plus the MVP demonstration. A five-minute video does not automatically complete these written fields.</w:t>
       </w:r>
     </w:p>
+    <w:p>
+      <w:pPr>
+        <w:pStyle w:val="Heading1"/>
+      </w:pPr>
+      <w:r>
+        <w:t>New care-access evidence: speaker reference</w:t>
+      </w:r>
+    </w:p>
+    <w:p>
+      <w:r>
+        <w:t>Source checked in the supplied CDC PLACES 2025 county-release CSV: Dutchess County, FIPS 36027; ACCESS2; 2023; adults aged 18–64; crude prevalence 6.5%, interval 5.1%–8.1%. This is a modeled community estimate, not Lyme-specific prevalence, an immigrant-specific measure, or evidence that PathwayAI reduces costs. The age-adjusted estimate is 6.9%; do not mix the two measures.</w:t>
+      </w:r>
+    </w:p>
+    <w:p>
+      <w:r>
+        <w:t>The Dutchess 2025–2030 Community Health Improvement Plan supports general access-and-coverage context. Its informal resident voting is not a Lyme sample or evidence of county adoption. Fresh official-site retrieval remains blocked; these references rely on supplied files and prior source reviews.</w:t>
+      </w:r>
+    </w:p>
+    <w:p>
+      <w:r>
+        <w:t>CDC PLACES: https://www.cdc.gov/places/</w:t>
+      </w:r>
+    </w:p>
+    <w:p>
+      <w:r>
+        <w:t>Dutchess plan: https://www.dutchessny.gov/Departments/DBCH/Docs/Dutchess-County-Community-Health-Improvement-Plan.pdf</w:t>
+      </w:r>
+    </w:p>
     <w:sectPr>
       <w:footerReference w:type="default" r:id="rId9"/>
       <w:pgSz w:w="12240" w:h="15840"/>

</xml_diff>

<commit_message>
Finalize narration against supplied HHS criteria and both MVP template decks
</commit_message>
<xml_diff>
--- a/submission/PathwayAI_Final_Script_and_20_Minute_QA.docx
+++ b/submission/PathwayAI_Final_Script_and_20_Minute_QA.docx
@@ -20,7 +20,7 @@
     </w:p>
     <w:p>
       <w:r>
-        <w:t>HHS TOPx Cost of Illness | Updated October 21, 2026</w:t>
+        <w:t>HHS TOPx Cost of Illness | Final narration | October 21, 2026</w:t>
       </w:r>
     </w:p>
     <w:p>
@@ -33,7 +33,7 @@
     </w:p>
     <w:p>
       <w:r>
-        <w:t>757 spoken words. Check actual audio against the five-minute limit. Bracketed delivery cues depend on the selected ElevenLabs model. State whether external AI is on or off during the demonstration; identify saved examples as previously generated.</w:t>
+        <w:t>748 spoken words. Measure the rendered audio and keep the complete presentation under five minutes. Bracketed cues depend on the ElevenLabs model. During the demonstration, identify whether external AI is on or off; saved AI outputs must be labeled as previously generated. This narration does not claim current county adoption, secure reporting, benefits verification or proven savings.</w:t>
       </w:r>
     </w:p>
     <w:p>
@@ -73,7 +73,7 @@
     </w:p>
     <w:p>
       <w:r>
-        <w:t>PathwayAI helps people make that burden visible—and connects practical support with evidence for community planning. [pause]</w:t>
+        <w:t>PathwayAI helps people make that burden visible—and connects practical support with public evidence for community planning. [pause]</w:t>
       </w:r>
     </w:p>
     <w:p>
@@ -83,7 +83,7 @@
     </w:p>
     <w:p>
       <w:r>
-        <w:t>Choose what would help today: outdoor preparation, help after a tick bite, preparing for care, or community planning. Quick and easy gives shorter explanations.</w:t>
+        <w:t>Choose your starting point: outdoor preparation, help after a tick bite, preparing for care, or community planning. There is also an option for reviewers. Choose Quick and easy for shorter explanations.</w:t>
       </w:r>
     </w:p>
     <w:p>
@@ -93,12 +93,12 @@
     </w:p>
     <w:p>
       <w:r>
-        <w:t>In Care and Support, people without insurance can find community health centers and questions about affordable care. Early Lyme disease can often be managed in primary care. Ask the center about evaluation, treatment, referrals, fees, and interpreters. Services vary; care is not automatically free. [pause]</w:t>
+        <w:t>In Care and Support, people without insurance can find community health centers and questions about affordable care. Early Lyme disease can often be managed in primary care. Ask the center about services, fees, and interpreters. Availability varies; care is not automatically free. [pause]</w:t>
       </w:r>
     </w:p>
     <w:p>
       <w:r>
-        <w:t>Now imagine preparing for an appointment. Every patient detail in this demonstration is fictional.</w:t>
+        <w:t>Now imagine preparing for an appointment. Every patient detail shown here is fictional.</w:t>
       </w:r>
     </w:p>
     <w:p>
@@ -113,7 +113,7 @@
     </w:p>
     <w:p>
       <w:r>
-        <w:t>With permission, optional external AI helps prepare an English summary alongside the original for review. It supports preparation, not diagnosis or qualified medical interpretation. The English organizer also works without external AI. [pause]</w:t>
+        <w:t>With permission, optional external AI helps prepare an English summary alongside the original for review. It supports communication, not diagnosis or qualified medical interpretation. The English organizer also works without external AI. [pause]</w:t>
       </w:r>
     </w:p>
     <w:p>
@@ -133,12 +133,12 @@
     </w:p>
     <w:p>
       <w:r>
-        <w:t>Download the appointment and cost summary. Use the care-access checklist when calling a clinic or billing office.</w:t>
+        <w:t>Download the appointment and cost summary. A clear record helps someone explain what support they need.</w:t>
       </w:r>
     </w:p>
     <w:p>
       <w:r>
-        <w:t>A total alone will not pay a bill. A clearer record can help someone explain what support they need. [pause]</w:t>
+        <w:t>Support choices include disability-benefits preparation, food, housing, temporary cash assistance, transportation, and help with bills. These link to programs or directories, not guaranteed assistance. [pause]</w:t>
       </w:r>
     </w:p>
     <w:p>
@@ -148,32 +148,32 @@
     </w:p>
     <w:p>
       <w:r>
-        <w:t>County health departments and community partners are our intended organizational users. Public data helps them frame decisions about limited resources.</w:t>
+        <w:t>County health departments and community partners are our intended organizational users.</w:t>
       </w:r>
     </w:p>
     <w:p>
       <w:r>
-        <w:t>For example, CDC PLACES estimates that 6.5 percent of Dutchess adults aged 18 to 64 lacked health insurance in 2023. The county health plan also identifies access and coverage concerns. These are community findings, not Lyme-specific estimates.</w:t>
+        <w:t>CDC PLACES estimates that 6.5 percent of Dutchess adults aged 18 to 64 lacked insurance in 2023. The county health plan also identifies access concerns. These are general community findings, not Lyme-specific estimates.</w:t>
       </w:r>
     </w:p>
     <w:p>
       <w:r>
-        <w:t>They give us a reason to explore care navigation—and a question to test. [short pause]</w:t>
+        <w:t>They give us a reason to explore care navigation. [short pause]</w:t>
       </w:r>
     </w:p>
     <w:p>
       <w:r>
-        <w:t>PathwayAI combines New York Lyme surveillance with Census population and language context, HRSA healthcare resources, CDC tick surveillance, and CDC PLACES estimates. CMS adds separate Original Medicare payment context—not Lyme-specific spending.</w:t>
+        <w:t>PathwayAI brings together New York Lyme surveillance, Census population and language data, HRSA healthcare resources, CDC tick surveillance, and CDC PLACES. CMS adds separate Original Medicare payment context—not Lyme-specific spending.</w:t>
       </w:r>
     </w:p>
     <w:p>
       <w:r>
-        <w:t>One calculation is fully visible: 1,060 Dutchess cases reported in 2024, multiplied by Hook’s societal-cost benchmark of 2,032 dollars, gives about 2.15 million dollars, expressed in 2016 dollars.</w:t>
+        <w:t>Here is one transparent calculation: 1,060 Dutchess cases reported in 2024, multiplied by Hook’s societal-cost benchmark of 2,032 dollars, gives about 2.15 million dollars in 2016 dollars.</w:t>
       </w:r>
     </w:p>
     <w:p>
       <w:r>
-        <w:t>That is a study-based illustration, not measured county spending. Our survey highlights experiences to investigate. Horn’s research supports attention to follow-up needs. Neither is added to that dollar total. [pause]</w:t>
+        <w:t>That is a study-based illustration, not measured county spending. Our survey informs questions about burden. Horn’s research supports attention to follow-up needs. Neither is added to that total. [pause]</w:t>
       </w:r>
     </w:p>
     <w:p>
@@ -183,7 +183,7 @@
     </w:p>
     <w:p>
       <w:r>
-        <w:t>At local events, partners could introduce prevention information and preparation tools. Residents could leave with a plan, a visit note, or questions about affordable care.</w:t>
+        <w:t>At local events, partners could share prevention information and preparation tools. Residents could leave with a plan, a visit note, or questions about affordable care.</w:t>
       </w:r>
     </w:p>
     <w:p>
@@ -193,7 +193,7 @@
     </w:p>
     <w:p>
       <w:r>
-        <w:t>Partners would confirm service capacity and resources, then track referrals completed, appointments reached, and needs still unmet. [pause]</w:t>
+        <w:t>Partners would confirm capacity and resources, then track completed referrals, appointments reached, and needs still unmet. [pause]</w:t>
       </w:r>
     </w:p>
     <w:p>
@@ -203,22 +203,22 @@
     </w:p>
     <w:p>
       <w:r>
-        <w:t>Mandarin-, Spanish-, and English-speaking reviewers have also been invited. That testing is ongoing.</w:t>
+        <w:t>Mandarin-, Spanish-, and English-speaking reviewers have also been invited. Testing is ongoing.</w:t>
       </w:r>
     </w:p>
     <w:p>
       <w:r>
-        <w:t>The app is publicly accessible. We welcome patient groups, health centers, and community partners for a small pilot. We will test usefulness before claiming better outcomes or savings.</w:t>
+        <w:t>The app is publicly accessible. We plan outreach through patient groups, health centers, and public-health partners. Grants and partnerships are our proposed model for keeping patient access free.</w:t>
       </w:r>
     </w:p>
     <w:p>
       <w:r>
-        <w:t>Grants and partnerships are our proposed model for keeping patient access free. The structure could be adapted to other illnesses after condition-specific review. [short pause]</w:t>
+        <w:t>Next, we seek a small partner pilot to test usefulness before claiming better outcomes or savings. The structure could be adapted to other illnesses after condition-specific review. [pause]</w:t>
       </w:r>
     </w:p>
     <w:p>
       <w:r>
-        <w:t>AI can help organize words. Data can reveal patterns. Patients remain at the center. [pause]</w:t>
+        <w:t>AI can help organize words. Data can reveal patterns. Patients remain at the center.</w:t>
       </w:r>
     </w:p>
     <w:p>
@@ -938,6 +938,29 @@
         <w:t>Dutchess plan: https://www.dutchessny.gov/Departments/DBCH/Docs/Dutchess-County-Community-Health-Improvement-Plan.pdf</w:t>
       </w:r>
     </w:p>
+    <w:p>
+      <w:pPr>
+        <w:pStyle w:val="Heading1"/>
+      </w:pPr>
+      <w:r>
+        <w:t>Final source and template check</w:t>
+      </w:r>
+    </w:p>
+    <w:p>
+      <w:r>
+        <w:t>Re-read both supplied MVP Demo Milestone.pptx and MVP Demo Milestone (4).pptx: both contain the same four-slide template. Rechecked the six-page original mockup as a concept visualization with simulated data. Simulated matched-patient counts, cost multipliers and projected savings are not findings and are excluded from narration.</w:t>
+      </w:r>
+    </w:p>
+    <w:p>
+      <w:r>
+        <w:t>Rechecked the user-supplied HHS/NIH challenge announcement: Cost of Illness; results for users; data/technology/evidence; execution/delivery; scalability/reuse. NIH live website access returned proxy HTTP 403 on October 21, 2026, so this does not establish independent verification of current website updates.</w:t>
+      </w:r>
+    </w:p>
+    <w:p>
+      <w:r>
+        <w:t>On-screen priorities: show one reviewed visit summary, the optional AI role accurately, one cost-and-time download, the county formula, and a proposed action. The grant/partnership sustainability model and consented reporting remain proposals. Check that the cover uses the official submitted title. Separate written submission fields still need completion.</w:t>
+      </w:r>
+    </w:p>
     <w:sectPr>
       <w:footerReference w:type="default" r:id="rId9"/>
       <w:pgSz w:w="12240" w:h="15840"/>

</xml_diff>

<commit_message>
Tighten final narration for the five-minute presentation limit
</commit_message>
<xml_diff>
--- a/submission/PathwayAI_Final_Script_and_20_Minute_QA.docx
+++ b/submission/PathwayAI_Final_Script_and_20_Minute_QA.docx
@@ -33,7 +33,7 @@
     </w:p>
     <w:p>
       <w:r>
-        <w:t>748 spoken words. Measure the rendered audio and keep the complete presentation under five minutes. Bracketed cues depend on the ElevenLabs model. During the demonstration, identify whether external AI is on or off; saved AI outputs must be labeled as previously generated. This narration does not claim current county adoption, secure reporting, benefits verification or proven savings.</w:t>
+        <w:t>690 spoken words. Measure the rendered audio and keep the complete presentation under five minutes. Bracketed cues depend on the ElevenLabs model. During the demonstration, identify whether external AI is on or off; saved AI outputs must be labeled as previously generated. This narration does not claim current county adoption, secure reporting, benefits verification or proven savings.</w:t>
       </w:r>
     </w:p>
     <w:p>
@@ -53,12 +53,12 @@
     </w:p>
     <w:p>
       <w:r>
-        <w:t>That experience taught me how difficult it can be to find care while worrying about costs—and how language can make those conversations harder.</w:t>
+        <w:t>Finding care, worrying about costs, and explaining symptoms in another language became personal concerns.</w:t>
       </w:r>
     </w:p>
     <w:p>
       <w:r>
-        <w:t>I kept thinking: how could we help another family feel better prepared?</w:t>
+        <w:t>How could we help another family feel better prepared?</w:t>
       </w:r>
     </w:p>
     <w:p>
@@ -83,7 +83,7 @@
     </w:p>
     <w:p>
       <w:r>
-        <w:t>Choose your starting point: outdoor preparation, help after a tick bite, preparing for care, or community planning. There is also an option for reviewers. Choose Quick and easy for shorter explanations.</w:t>
+        <w:t>Choose outdoor preparation, help after a tick bite, care and support, or community planning. Reviewers have their own route. Quick and easy gives shorter explanations.</w:t>
       </w:r>
     </w:p>
     <w:p>
@@ -93,12 +93,12 @@
     </w:p>
     <w:p>
       <w:r>
-        <w:t>In Care and Support, people without insurance can find community health centers and questions about affordable care. Early Lyme disease can often be managed in primary care. Ask the center about services, fees, and interpreters. Availability varies; care is not automatically free. [pause]</w:t>
+        <w:t>Care and Support links uninsured people to community health centers and questions about affordable care. Early Lyme disease can often be managed in primary care. Confirm services, fees, and interpreters; care is not automatically free. [pause]</w:t>
       </w:r>
     </w:p>
     <w:p>
       <w:r>
-        <w:t>Now imagine preparing for an appointment. Every patient detail shown here is fictional.</w:t>
+        <w:t>Now prepare for an appointment using fictional details.</w:t>
       </w:r>
     </w:p>
     <w:p>
@@ -108,7 +108,7 @@
     </w:p>
     <w:p>
       <w:r>
-        <w:t>For someone uncomfortable speaking English, explaining symptoms can feel overwhelming. People can write in their preferred language or mix languages.</w:t>
+        <w:t>Explaining symptoms in English can feel overwhelming. People can write in their preferred language or mix languages.</w:t>
       </w:r>
     </w:p>
     <w:p>
@@ -153,12 +153,12 @@
     </w:p>
     <w:p>
       <w:r>
-        <w:t>CDC PLACES estimates that 6.5 percent of Dutchess adults aged 18 to 64 lacked insurance in 2023. The county health plan also identifies access concerns. These are general community findings, not Lyme-specific estimates.</w:t>
+        <w:t>CDC PLACES estimates that 6.5 percent of Dutchess adults aged 18 to 64 lacked insurance in 2023. This is general context, not Lyme-specific evidence. It supports exploring care navigation.</w:t>
       </w:r>
     </w:p>
     <w:p>
       <w:r>
-        <w:t>They give us a reason to explore care navigation. [short pause]</w:t>
+        <w:t>[short pause]</w:t>
       </w:r>
     </w:p>
     <w:p>
@@ -173,7 +173,7 @@
     </w:p>
     <w:p>
       <w:r>
-        <w:t>That is a study-based illustration, not measured county spending. Our survey informs questions about burden. Horn’s research supports attention to follow-up needs. Neither is added to that total. [pause]</w:t>
+        <w:t>That is an illustration, not measured county spending. Survey experiences and Horn’s follow-up research inform questions; neither is added to that total. [pause]</w:t>
       </w:r>
     </w:p>
     <w:p>
@@ -183,7 +183,7 @@
     </w:p>
     <w:p>
       <w:r>
-        <w:t>At local events, partners could share prevention information and preparation tools. Residents could leave with a plan, a visit note, or questions about affordable care.</w:t>
+        <w:t>At local events, partners could help residents leave with a prevention plan, a visit note, or questions about affordable care.</w:t>
       </w:r>
     </w:p>
     <w:p>
@@ -203,7 +203,7 @@
     </w:p>
     <w:p>
       <w:r>
-        <w:t>Mandarin-, Spanish-, and English-speaking reviewers have also been invited. Testing is ongoing.</w:t>
+        <w:t>Mandarin-, Spanish-, and English-speaking reviewers have been invited; testing is ongoing.</w:t>
       </w:r>
     </w:p>
     <w:p>

</xml_diff>

<commit_message>
Reflect formative reviewer feedback in narration and refresh review exports
</commit_message>
<xml_diff>
--- a/submission/PathwayAI_Final_Script_and_20_Minute_QA.docx
+++ b/submission/PathwayAI_Final_Script_and_20_Minute_QA.docx
@@ -20,7 +20,7 @@
     </w:p>
     <w:p>
       <w:r>
-        <w:t>HHS TOPx Cost of Illness | Final narration | October 21, 2026</w:t>
+        <w:t>HHS TOPx Cost of Illness | Updated October 21, 2026</w:t>
       </w:r>
     </w:p>
     <w:p>
@@ -33,7 +33,7 @@
     </w:p>
     <w:p>
       <w:r>
-        <w:t>690 spoken words. Measure the rendered audio and keep the complete presentation under five minutes. Bracketed cues depend on the ElevenLabs model. During the demonstration, identify whether external AI is on or off; saved AI outputs must be labeled as previously generated. This narration does not claim current county adoption, secure reporting, benefits verification or proven savings.</w:t>
+        <w:t>710 spoken words. Time the actual generated audio against the five-minute limit. Bracketed cues depend on the ElevenLabs model. Identify whether external AI is on or off; label saved examples as previously generated. User comments are formative feedback, not proof of efficacy or endorsement.</w:t>
       </w:r>
     </w:p>
     <w:p>
@@ -83,7 +83,7 @@
     </w:p>
     <w:p>
       <w:r>
-        <w:t>Choose outdoor preparation, help after a tick bite, care and support, or community planning. Reviewers have their own route. Quick and easy gives shorter explanations.</w:t>
+        <w:t>Choose the route that fits you. Quick and easy gives shorter explanations; reviewers have their own route.</w:t>
       </w:r>
     </w:p>
     <w:p>
@@ -93,7 +93,7 @@
     </w:p>
     <w:p>
       <w:r>
-        <w:t>Care and Support links uninsured people to community health centers and questions about affordable care. Early Lyme disease can often be managed in primary care. Confirm services, fees, and interpreters; care is not automatically free. [pause]</w:t>
+        <w:t>Care and Support links people to community health centers and affordable-care questions. Confirm Lyme services, fees, and interpreters; care is not automatically free. [pause]</w:t>
       </w:r>
     </w:p>
     <w:p>
@@ -103,7 +103,7 @@
     </w:p>
     <w:p>
       <w:r>
-        <w:t>Enter what happened. Review and correct the timeline. Download the visit summary and bring the original test report.</w:t>
+        <w:t>Review the timeline, correct it, and download the visit summary. Bring the original test report.</w:t>
       </w:r>
     </w:p>
     <w:p>
@@ -113,7 +113,7 @@
     </w:p>
     <w:p>
       <w:r>
-        <w:t>With permission, optional external AI helps prepare an English summary alongside the original for review. It supports communication, not diagnosis or qualified medical interpretation. The English organizer also works without external AI. [pause]</w:t>
+        <w:t>With permission, optional external AI prepares an English summary alongside the original for review. It does not diagnose or replace qualified interpretation. The English organizer also works without external AI. [pause]</w:t>
       </w:r>
     </w:p>
     <w:p>
@@ -153,27 +153,22 @@
     </w:p>
     <w:p>
       <w:r>
-        <w:t>CDC PLACES estimates that 6.5 percent of Dutchess adults aged 18 to 64 lacked insurance in 2023. This is general context, not Lyme-specific evidence. It supports exploring care navigation.</w:t>
+        <w:t>CDC PLACES estimates that 6.5 percent of Dutchess adults aged 18 to 64 lacked insurance in 2023. This is general context, not Lyme-specific evidence. It supports exploring care navigation. [short pause]</w:t>
       </w:r>
     </w:p>
     <w:p>
       <w:r>
-        <w:t>[short pause]</w:t>
+        <w:t>Federal sources include Census, HRSA, CDC tick surveillance, CDC PLACES, and CMS Medicare data. New York adds Lyme surveillance. Medicare payments remain separate from Lyme costs.</w:t>
       </w:r>
     </w:p>
     <w:p>
       <w:r>
-        <w:t>PathwayAI brings together New York Lyme surveillance, Census population and language data, HRSA healthcare resources, CDC tick surveillance, and CDC PLACES. CMS adds separate Original Medicare payment context—not Lyme-specific spending.</w:t>
+        <w:t>The calculation is visible: 1,060 Dutchess cases reported in 2024, times Hook’s societal-cost benchmark of 2,032 dollars, gives about 2.15 million dollars in 2016 dollars.</w:t>
       </w:r>
     </w:p>
     <w:p>
       <w:r>
-        <w:t>Here is one transparent calculation: 1,060 Dutchess cases reported in 2024, multiplied by Hook’s societal-cost benchmark of 2,032 dollars, gives about 2.15 million dollars in 2016 dollars.</w:t>
-      </w:r>
-    </w:p>
-    <w:p>
-      <w:r>
-        <w:t>That is an illustration, not measured county spending. Survey experiences and Horn’s follow-up research inform questions; neither is added to that total. [pause]</w:t>
+        <w:t>That is an illustration, not measured county spending. Our survey and Horn’s follow-up research inform questions, not additional dollar costs. [pause]</w:t>
       </w:r>
     </w:p>
     <w:p>
@@ -183,7 +178,7 @@
     </w:p>
     <w:p>
       <w:r>
-        <w:t>At local events, partners could help residents leave with a prevention plan, a visit note, or questions about affordable care.</w:t>
+        <w:t>Counties with high reported Lyme rates could link to PathwayAI on their websites and introduce it at local events, complementing existing prevention and support programs.</w:t>
       </w:r>
     </w:p>
     <w:p>
@@ -198,7 +193,12 @@
     </w:p>
     <w:p>
       <w:r>
-        <w:t>[hopeful] People living with Lyme disease and a county health commissioner reviewed the working app. Their feedback helped us simplify instructions and make resources available without entering a story.</w:t>
+        <w:t>[hopeful] People living with Lyme disease and a county health commissioner reviewed the working app. One reviewer called it “a great start for a very useful tool.” Others offered to share the survey.</w:t>
+      </w:r>
+    </w:p>
+    <w:p>
+      <w:r>
+        <w:t>Reviewers also found problems. Their feedback led to clearer navigation and stronger checks that costs remain saved when switching pages.</w:t>
       </w:r>
     </w:p>
     <w:p>
@@ -208,12 +208,17 @@
     </w:p>
     <w:p>
       <w:r>
-        <w:t>The app is publicly accessible. We plan outreach through patient groups, health centers, and public-health partners. Grants and partnerships are our proposed model for keeping patient access free.</w:t>
+        <w:t>The app is public. We seek patient groups, health centers, and public-health partners for outreach, with grants and partnerships proposed to keep patient access free.</w:t>
       </w:r>
     </w:p>
     <w:p>
       <w:r>
-        <w:t>Next, we seek a small partner pilot to test usefulness before claiming better outcomes or savings. The structure could be adapted to other illnesses after condition-specific review. [pause]</w:t>
+        <w:t>Next, we seek a small partner pilot to test usefulness and support connections. Reducing financial strain and long-term disability is a goal—not an outcome we have demonstrated. The structure could be adapted to other illnesses after review. [pause]</w:t>
+      </w:r>
+    </w:p>
+    <w:p>
+      <w:r>
+        <w:t>A family member told me they wished they could have used PathwayAI earlier. That stayed with me.</w:t>
       </w:r>
     </w:p>
     <w:p>
@@ -961,6 +966,24 @@
         <w:t>On-screen priorities: show one reviewed visit summary, the optional AI role accurately, one cost-and-time download, the county formula, and a proposed action. The grant/partnership sustainability model and consented reporting remain proposals. Check that the cover uses the official submitted title. Separate written submission fields still need completion.</w:t>
       </w:r>
     </w:p>
+    <w:p>
+      <w:pPr>
+        <w:pStyle w:val="Heading1"/>
+      </w:pPr>
+      <w:r>
+        <w:t>Reviewer feedback and cost-retention correction</w:t>
+      </w:r>
+    </w:p>
+    <w:p>
+      <w:r>
+        <w:t>The family comment is paraphrased from the presenter’s account. “A great start for a very useful tool” is reviewer feedback, not a clinical finding. Offers to share the survey are outreach support, not completed responses or representative validation. Reduced long-term disability and costs remain goals.</w:t>
+      </w:r>
+    </w:p>
+    <w:p>
+      <w:r>
+        <w:t>Cost-retention fix: preserve cost/time widgets through section changes and explicitly send retained values back to the browser while keeping numeric fields clearable. Regression coverage includes $123 medical, $20 other, three missed workdays, eight caregiver hours and $100/day modeled work loss; return from community planning, edit a clinician question, and verify summaries. Intentional clearing remains valid. Data remains session-only, not permanent storage.</w:t>
+      </w:r>
+    </w:p>
     <w:sectPr>
       <w:footerReference w:type="default" r:id="rId9"/>
       <w:pgSz w:w="12240" w:h="15840"/>

</xml_diff>